<commit_message>
install next js app on client
</commit_message>
<xml_diff>
--- a/backend chart of startup.docx
+++ b/backend chart of startup.docx
@@ -1,6 +1,6 @@
 
 <file path=word/document.xml><?xml version="1.0" encoding="utf-8"?>
-<w:document xmlns:wpc="http://schemas.microsoft.com/office/word/2010/wordprocessingCanvas" xmlns:cx="http://schemas.microsoft.com/office/drawing/2014/chartex" xmlns:cx1="http://schemas.microsoft.com/office/drawing/2015/9/8/chartex" xmlns:cx2="http://schemas.microsoft.com/office/drawing/2015/10/21/chartex" xmlns:cx3="http://schemas.microsoft.com/office/drawing/2016/5/9/chartex" xmlns:cx4="http://schemas.microsoft.com/office/drawing/2016/5/10/chartex" xmlns:cx5="http://schemas.microsoft.com/office/drawing/2016/5/11/chartex" xmlns:cx6="http://schemas.microsoft.com/office/drawing/2016/5/12/chartex" xmlns:cx7="http://schemas.microsoft.com/office/drawing/2016/5/13/chartex" xmlns:cx8="http://schemas.microsoft.com/office/drawing/2016/5/14/chartex" xmlns:mc="http://schemas.openxmlformats.org/markup-compatibility/2006" xmlns:aink="http://schemas.microsoft.com/office/drawing/2016/ink" xmlns:am3d="http://schemas.microsoft.com/office/drawing/2017/model3d" xmlns:o="urn:schemas-microsoft-com:office:office" xmlns:oel="http://schemas.microsoft.com/office/2019/extlst" xmlns:r="http://schemas.openxmlformats.org/officeDocument/2006/relationships" xmlns:m="http://schemas.openxmlformats.org/officeDocument/2006/math" xmlns:v="urn:schemas-microsoft-com:vml" xmlns:wp14="http://schemas.microsoft.com/office/word/2010/wordprocessingDrawing" xmlns:wp="http://schemas.openxmlformats.org/drawingml/2006/wordprocessingDrawing" xmlns:w10="urn:schemas-microsoft-com:office:word" xmlns:w="http://schemas.openxmlformats.org/wordprocessingml/2006/main" xmlns:w14="http://schemas.microsoft.com/office/word/2010/wordml" xmlns:w15="http://schemas.microsoft.com/office/word/2012/wordml" xmlns:w16cex="http://schemas.microsoft.com/office/word/2018/wordml/cex" xmlns:w16cid="http://schemas.microsoft.com/office/word/2016/wordml/cid" xmlns:w16="http://schemas.microsoft.com/office/word/2018/wordml" xmlns:w16du="http://schemas.microsoft.com/office/word/2023/wordml/word16du" xmlns:w16sdtdh="http://schemas.microsoft.com/office/word/2020/wordml/sdtdatahash" xmlns:w16sdtfl="http://schemas.microsoft.com/office/word/2024/wordml/sdtformatlock" xmlns:w16se="http://schemas.microsoft.com/office/word/2015/wordml/symex" xmlns:wpg="http://schemas.microsoft.com/office/word/2010/wordprocessingGroup" xmlns:wpi="http://schemas.microsoft.com/office/word/2010/wordprocessingInk" xmlns:wne="http://schemas.microsoft.com/office/word/2006/wordml" xmlns:wps="http://schemas.microsoft.com/office/word/2010/wordprocessingShape" mc:Ignorable="w14 w15 w16se w16cid w16 w16cex w16sdtdh w16sdtfl w16du wp14">
+<w:document xmlns:wpc="http://schemas.microsoft.com/office/word/2010/wordprocessingCanvas" xmlns:cx="http://schemas.microsoft.com/office/drawing/2014/chartex" xmlns:mc="http://schemas.openxmlformats.org/markup-compatibility/2006" xmlns:o="urn:schemas-microsoft-com:office:office" xmlns:r="http://schemas.openxmlformats.org/officeDocument/2006/relationships" xmlns:m="http://schemas.openxmlformats.org/officeDocument/2006/math" xmlns:v="urn:schemas-microsoft-com:vml" xmlns:wp14="http://schemas.microsoft.com/office/word/2010/wordprocessingDrawing" xmlns:wp="http://schemas.openxmlformats.org/drawingml/2006/wordprocessingDrawing" xmlns:w10="urn:schemas-microsoft-com:office:word" xmlns:w="http://schemas.openxmlformats.org/wordprocessingml/2006/main" xmlns:w14="http://schemas.microsoft.com/office/word/2010/wordml" xmlns:w15="http://schemas.microsoft.com/office/word/2012/wordml" xmlns:w16se="http://schemas.microsoft.com/office/word/2015/wordml/symex" xmlns:wpg="http://schemas.microsoft.com/office/word/2010/wordprocessingGroup" xmlns:wpi="http://schemas.microsoft.com/office/word/2010/wordprocessingInk" xmlns:wne="http://schemas.microsoft.com/office/word/2006/wordml" xmlns:wps="http://schemas.microsoft.com/office/word/2010/wordprocessingShape" mc:Ignorable="w14 w15 w16se wp14">
   <w:body>
     <w:p>
       <w:pPr>
@@ -721,7 +721,23 @@
           <w:b/>
           <w:bCs/>
         </w:rPr>
-        <w:t>/config/</w:t>
+        <w:t>/</w:t>
+      </w:r>
+      <w:proofErr w:type="spellStart"/>
+      <w:r>
+        <w:rPr>
+          <w:b/>
+          <w:bCs/>
+        </w:rPr>
+        <w:t>config</w:t>
+      </w:r>
+      <w:proofErr w:type="spellEnd"/>
+      <w:r>
+        <w:rPr>
+          <w:b/>
+          <w:bCs/>
+        </w:rPr>
+        <w:t>/</w:t>
       </w:r>
     </w:p>
     <w:p>
@@ -1720,13 +1736,8 @@
         </w:numPr>
       </w:pPr>
       <w:r>
-        <w:t>/</w:t>
-      </w:r>
-      <w:proofErr w:type="gramStart"/>
-      <w:r>
-        <w:t>register</w:t>
-      </w:r>
-      <w:proofErr w:type="gramEnd"/>
+        <w:t>/register</w:t>
+      </w:r>
     </w:p>
     <w:p>
       <w:pPr>
@@ -1736,13 +1747,8 @@
         </w:numPr>
       </w:pPr>
       <w:r>
-        <w:t>/</w:t>
-      </w:r>
-      <w:proofErr w:type="gramStart"/>
-      <w:r>
-        <w:t>login</w:t>
-      </w:r>
-      <w:proofErr w:type="gramEnd"/>
+        <w:t>/login</w:t>
+      </w:r>
     </w:p>
     <w:p>
       <w:pPr>
@@ -1849,13 +1855,8 @@
         </w:numPr>
       </w:pPr>
       <w:r>
-        <w:t>/</w:t>
-      </w:r>
-      <w:proofErr w:type="gramStart"/>
-      <w:r>
-        <w:t>food</w:t>
-      </w:r>
-      <w:proofErr w:type="gramEnd"/>
+        <w:t>/food</w:t>
+      </w:r>
     </w:p>
     <w:p>
       <w:pPr>
@@ -1876,15 +1877,7 @@
         </w:numPr>
       </w:pPr>
       <w:r>
-        <w:t>/</w:t>
-      </w:r>
-      <w:proofErr w:type="gramStart"/>
-      <w:r>
-        <w:t>food</w:t>
-      </w:r>
-      <w:proofErr w:type="gramEnd"/>
-      <w:r>
-        <w:t>/vendor</w:t>
+        <w:t>/food/vendor</w:t>
       </w:r>
       <w:proofErr w:type="gramStart"/>
       <w:r>
@@ -1953,15 +1946,7 @@
         </w:numPr>
       </w:pPr>
       <w:r>
-        <w:t>/</w:t>
-      </w:r>
-      <w:proofErr w:type="gramStart"/>
-      <w:r>
-        <w:t>order</w:t>
-      </w:r>
-      <w:proofErr w:type="gramEnd"/>
-      <w:r>
-        <w:t>/user/:id</w:t>
+        <w:t>/order/user/:id</w:t>
       </w:r>
     </w:p>
     <w:p>
@@ -2092,7 +2077,23 @@
           <w:b/>
           <w:bCs/>
         </w:rPr>
-        <w:t>/utils/</w:t>
+        <w:t>/</w:t>
+      </w:r>
+      <w:proofErr w:type="spellStart"/>
+      <w:r>
+        <w:rPr>
+          <w:b/>
+          <w:bCs/>
+        </w:rPr>
+        <w:t>utils</w:t>
+      </w:r>
+      <w:proofErr w:type="spellEnd"/>
+      <w:r>
+        <w:rPr>
+          <w:b/>
+          <w:bCs/>
+        </w:rPr>
+        <w:t>/</w:t>
       </w:r>
     </w:p>
     <w:p>
@@ -2673,7 +2674,6 @@
           </w:tcPr>
           <w:p>
             <w:proofErr w:type="spellStart"/>
-            <w:proofErr w:type="gramStart"/>
             <w:r>
               <w:rPr>
                 <w:b/>
@@ -2682,7 +2682,6 @@
               <w:t>package.json</w:t>
             </w:r>
             <w:proofErr w:type="spellEnd"/>
-            <w:proofErr w:type="gramEnd"/>
           </w:p>
         </w:tc>
         <w:tc>
@@ -2938,11 +2937,14 @@
       <w:r>
         <w:t xml:space="preserve">, </w:t>
       </w:r>
-      <w:proofErr w:type="gramStart"/>
-      <w:r>
-        <w:t>lng }</w:t>
-      </w:r>
-      <w:proofErr w:type="gramEnd"/>
+      <w:proofErr w:type="spellStart"/>
+      <w:r>
+        <w:t>lng</w:t>
+      </w:r>
+      <w:proofErr w:type="spellEnd"/>
+      <w:r>
+        <w:t xml:space="preserve"> }</w:t>
+      </w:r>
     </w:p>
     <w:p>
       <w:r>
@@ -3101,11 +3103,14 @@
       <w:r>
         <w:t xml:space="preserve">, </w:t>
       </w:r>
-      <w:proofErr w:type="gramStart"/>
-      <w:r>
-        <w:t>lng }</w:t>
-      </w:r>
-      <w:proofErr w:type="gramEnd"/>
+      <w:proofErr w:type="spellStart"/>
+      <w:r>
+        <w:t>lng</w:t>
+      </w:r>
+      <w:proofErr w:type="spellEnd"/>
+      <w:r>
+        <w:t xml:space="preserve"> }</w:t>
+      </w:r>
     </w:p>
     <w:p>
       <w:r>
@@ -3683,17 +3688,12 @@
         <w:t xml:space="preserve">, </w:t>
       </w:r>
       <w:proofErr w:type="spellStart"/>
-      <w:proofErr w:type="gramStart"/>
       <w:r>
         <w:t>lng</w:t>
       </w:r>
       <w:proofErr w:type="spellEnd"/>
       <w:r>
-        <w:t xml:space="preserve"> }</w:t>
-      </w:r>
-      <w:proofErr w:type="gramEnd"/>
-      <w:r>
-        <w:t>,</w:t>
+        <w:t xml:space="preserve"> },</w:t>
       </w:r>
     </w:p>
     <w:p>
@@ -3826,7 +3826,23 @@
           <w:b/>
           <w:bCs/>
         </w:rPr>
-        <w:t>/auth)</w:t>
+        <w:t>/</w:t>
+      </w:r>
+      <w:proofErr w:type="spellStart"/>
+      <w:r>
+        <w:rPr>
+          <w:b/>
+          <w:bCs/>
+        </w:rPr>
+        <w:t>auth</w:t>
+      </w:r>
+      <w:proofErr w:type="spellEnd"/>
+      <w:r>
+        <w:rPr>
+          <w:b/>
+          <w:bCs/>
+        </w:rPr>
+        <w:t>)</w:t>
       </w:r>
     </w:p>
     <w:tbl>
@@ -3942,13 +3958,8 @@
           </w:tcPr>
           <w:p>
             <w:r>
-              <w:t>/</w:t>
+              <w:t>/register</w:t>
             </w:r>
-            <w:proofErr w:type="gramStart"/>
-            <w:r>
-              <w:t>register</w:t>
-            </w:r>
-            <w:proofErr w:type="gramEnd"/>
           </w:p>
         </w:tc>
         <w:tc>
@@ -3988,13 +3999,8 @@
           </w:tcPr>
           <w:p>
             <w:r>
-              <w:t>/</w:t>
+              <w:t>/login</w:t>
             </w:r>
-            <w:proofErr w:type="gramStart"/>
-            <w:r>
-              <w:t>login</w:t>
-            </w:r>
-            <w:proofErr w:type="gramEnd"/>
           </w:p>
         </w:tc>
         <w:tc>
@@ -4285,13 +4291,8 @@
           </w:tcPr>
           <w:p>
             <w:r>
-              <w:t>/</w:t>
+              <w:t>/profile</w:t>
             </w:r>
-            <w:proofErr w:type="gramStart"/>
-            <w:r>
-              <w:t>profile</w:t>
-            </w:r>
-            <w:proofErr w:type="gramEnd"/>
           </w:p>
         </w:tc>
         <w:tc>
@@ -4331,13 +4332,8 @@
           </w:tcPr>
           <w:p>
             <w:r>
-              <w:t>/</w:t>
+              <w:t>/orders</w:t>
             </w:r>
-            <w:proofErr w:type="gramStart"/>
-            <w:r>
-              <w:t>orders</w:t>
-            </w:r>
-            <w:proofErr w:type="gramEnd"/>
           </w:p>
         </w:tc>
         <w:tc>
@@ -4587,15 +4583,7 @@
           </w:tcPr>
           <w:p>
             <w:r>
-              <w:t>/</w:t>
-            </w:r>
-            <w:proofErr w:type="gramStart"/>
-            <w:r>
-              <w:t>add</w:t>
-            </w:r>
-            <w:proofErr w:type="gramEnd"/>
-            <w:r>
-              <w:t>-food</w:t>
+              <w:t>/add-food</w:t>
             </w:r>
           </w:p>
         </w:tc>
@@ -4718,13 +4706,8 @@
           </w:tcPr>
           <w:p>
             <w:r>
-              <w:t>/</w:t>
+              <w:t>/orders</w:t>
             </w:r>
-            <w:proofErr w:type="gramStart"/>
-            <w:r>
-              <w:t>orders</w:t>
-            </w:r>
-            <w:proofErr w:type="gramEnd"/>
           </w:p>
         </w:tc>
         <w:tc>
@@ -4974,18 +4957,13 @@
           </w:tcPr>
           <w:p>
             <w:r>
-              <w:t>/vendor</w:t>
-            </w:r>
-            <w:proofErr w:type="gramStart"/>
-            <w:r>
-              <w:t>/:</w:t>
+              <w:t>/vendor/:</w:t>
             </w:r>
             <w:proofErr w:type="spellStart"/>
             <w:r>
               <w:t>vendorId</w:t>
             </w:r>
             <w:proofErr w:type="spellEnd"/>
-            <w:proofErr w:type="gramEnd"/>
           </w:p>
         </w:tc>
         <w:tc>
@@ -5154,13 +5132,8 @@
           </w:tcPr>
           <w:p>
             <w:r>
-              <w:t>/</w:t>
+              <w:t>/create</w:t>
             </w:r>
-            <w:proofErr w:type="gramStart"/>
-            <w:r>
-              <w:t>create</w:t>
-            </w:r>
-            <w:proofErr w:type="gramEnd"/>
           </w:p>
         </w:tc>
         <w:tc>
@@ -5282,18 +5255,13 @@
           </w:tcPr>
           <w:p>
             <w:r>
-              <w:t>/user</w:t>
-            </w:r>
-            <w:proofErr w:type="gramStart"/>
-            <w:r>
-              <w:t>/:</w:t>
+              <w:t>/user/:</w:t>
             </w:r>
             <w:proofErr w:type="spellStart"/>
             <w:r>
               <w:t>userId</w:t>
             </w:r>
             <w:proofErr w:type="spellEnd"/>
-            <w:proofErr w:type="gramEnd"/>
           </w:p>
         </w:tc>
         <w:tc>
@@ -5333,18 +5301,13 @@
           </w:tcPr>
           <w:p>
             <w:r>
-              <w:t>/vendor</w:t>
-            </w:r>
-            <w:proofErr w:type="gramStart"/>
-            <w:r>
-              <w:t>/:</w:t>
+              <w:t>/vendor/:</w:t>
             </w:r>
             <w:proofErr w:type="spellStart"/>
             <w:r>
               <w:t>vendorId</w:t>
             </w:r>
             <w:proofErr w:type="spellEnd"/>
-            <w:proofErr w:type="gramEnd"/>
           </w:p>
         </w:tc>
         <w:tc>
@@ -5512,13 +5475,8 @@
           </w:tcPr>
           <w:p>
             <w:r>
-              <w:t>/</w:t>
+              <w:t>/available</w:t>
             </w:r>
-            <w:proofErr w:type="gramStart"/>
-            <w:r>
-              <w:t>available</w:t>
-            </w:r>
-            <w:proofErr w:type="gramEnd"/>
           </w:p>
         </w:tc>
         <w:tc>
@@ -5558,18 +5516,13 @@
           </w:tcPr>
           <w:p>
             <w:r>
-              <w:t>/assign</w:t>
-            </w:r>
-            <w:proofErr w:type="gramStart"/>
-            <w:r>
-              <w:t>/:</w:t>
+              <w:t>/assign/:</w:t>
             </w:r>
             <w:proofErr w:type="spellStart"/>
             <w:r>
               <w:t>orderId</w:t>
             </w:r>
             <w:proofErr w:type="spellEnd"/>
-            <w:proofErr w:type="gramEnd"/>
           </w:p>
         </w:tc>
         <w:tc>
@@ -5650,13 +5603,8 @@
           </w:tcPr>
           <w:p>
             <w:r>
-              <w:t>/</w:t>
+              <w:t>/login</w:t>
             </w:r>
-            <w:proofErr w:type="gramStart"/>
-            <w:r>
-              <w:t>login</w:t>
-            </w:r>
-            <w:proofErr w:type="gramEnd"/>
           </w:p>
         </w:tc>
         <w:tc>
@@ -6243,48 +6191,31 @@
       </w:r>
     </w:p>
     <w:p>
-      <w:r>
-        <w:t>Just tell me:</w:t>
-      </w:r>
-      <w:r>
-        <w:br/>
-      </w:r>
-      <w:r>
-        <w:rPr>
-          <w:b/>
-          <w:bCs/>
-        </w:rPr>
-        <w:t>“Give me full backend code”</w:t>
-      </w:r>
-      <w:r>
-        <w:t xml:space="preserve"> or</w:t>
-      </w:r>
-      <w:r>
-        <w:br/>
-      </w:r>
-      <w:r>
-        <w:rPr>
-          <w:b/>
-          <w:bCs/>
-        </w:rPr>
-        <w:t>“Start with models”</w:t>
-      </w:r>
-      <w:r>
-        <w:t xml:space="preserve"> or</w:t>
-      </w:r>
-      <w:r>
-        <w:br/>
-      </w:r>
-      <w:r>
-        <w:rPr>
-          <w:b/>
-          <w:bCs/>
-        </w:rPr>
-        <w:t>“Start with auth system”</w:t>
-      </w:r>
-      <w:r>
-        <w:t>.</w:t>
-      </w:r>
+      <w:pPr>
+        <w:rPr>
+          <w:b/>
+          <w:sz w:val="40"/>
+        </w:rPr>
+      </w:pPr>
+      <w:proofErr w:type="spellStart"/>
+      <w:r>
+        <w:rPr>
+          <w:b/>
+          <w:sz w:val="40"/>
+        </w:rPr>
+        <w:t>Colors</w:t>
+      </w:r>
+      <w:proofErr w:type="spellEnd"/>
+    </w:p>
+    <w:p>
+      <w:pPr>
+        <w:rPr>
+          <w:sz w:val="28"/>
+          <w:szCs w:val="28"/>
+        </w:rPr>
+      </w:pPr>
+      <w:bookmarkStart w:id="0" w:name="_GoBack"/>
+      <w:bookmarkEnd w:id="0"/>
     </w:p>
     <w:sectPr>
       <w:pgSz w:w="11906" w:h="16838"/>
@@ -6297,7 +6228,7 @@
 </file>
 
 <file path=word/numbering.xml><?xml version="1.0" encoding="utf-8"?>
-<w:numbering xmlns:wpc="http://schemas.microsoft.com/office/word/2010/wordprocessingCanvas" xmlns:cx="http://schemas.microsoft.com/office/drawing/2014/chartex" xmlns:cx1="http://schemas.microsoft.com/office/drawing/2015/9/8/chartex" xmlns:cx2="http://schemas.microsoft.com/office/drawing/2015/10/21/chartex" xmlns:cx3="http://schemas.microsoft.com/office/drawing/2016/5/9/chartex" xmlns:cx4="http://schemas.microsoft.com/office/drawing/2016/5/10/chartex" xmlns:cx5="http://schemas.microsoft.com/office/drawing/2016/5/11/chartex" xmlns:cx6="http://schemas.microsoft.com/office/drawing/2016/5/12/chartex" xmlns:cx7="http://schemas.microsoft.com/office/drawing/2016/5/13/chartex" xmlns:cx8="http://schemas.microsoft.com/office/drawing/2016/5/14/chartex" xmlns:mc="http://schemas.openxmlformats.org/markup-compatibility/2006" xmlns:aink="http://schemas.microsoft.com/office/drawing/2016/ink" xmlns:am3d="http://schemas.microsoft.com/office/drawing/2017/model3d" xmlns:o="urn:schemas-microsoft-com:office:office" xmlns:oel="http://schemas.microsoft.com/office/2019/extlst" xmlns:r="http://schemas.openxmlformats.org/officeDocument/2006/relationships" xmlns:m="http://schemas.openxmlformats.org/officeDocument/2006/math" xmlns:v="urn:schemas-microsoft-com:vml" xmlns:wp14="http://schemas.microsoft.com/office/word/2010/wordprocessingDrawing" xmlns:wp="http://schemas.openxmlformats.org/drawingml/2006/wordprocessingDrawing" xmlns:w10="urn:schemas-microsoft-com:office:word" xmlns:w="http://schemas.openxmlformats.org/wordprocessingml/2006/main" xmlns:w14="http://schemas.microsoft.com/office/word/2010/wordml" xmlns:w15="http://schemas.microsoft.com/office/word/2012/wordml" xmlns:w16cex="http://schemas.microsoft.com/office/word/2018/wordml/cex" xmlns:w16cid="http://schemas.microsoft.com/office/word/2016/wordml/cid" xmlns:w16="http://schemas.microsoft.com/office/word/2018/wordml" xmlns:w16du="http://schemas.microsoft.com/office/word/2023/wordml/word16du" xmlns:w16sdtdh="http://schemas.microsoft.com/office/word/2020/wordml/sdtdatahash" xmlns:w16sdtfl="http://schemas.microsoft.com/office/word/2024/wordml/sdtformatlock" xmlns:w16se="http://schemas.microsoft.com/office/word/2015/wordml/symex" xmlns:wpg="http://schemas.microsoft.com/office/word/2010/wordprocessingGroup" xmlns:wpi="http://schemas.microsoft.com/office/word/2010/wordprocessingInk" xmlns:wne="http://schemas.microsoft.com/office/word/2006/wordml" xmlns:wps="http://schemas.microsoft.com/office/word/2010/wordprocessingShape" mc:Ignorable="w14 w15 w16se w16cid w16 w16cex w16sdtdh w16sdtfl w16du wp14">
+<w:numbering xmlns:wpc="http://schemas.microsoft.com/office/word/2010/wordprocessingCanvas" xmlns:cx="http://schemas.microsoft.com/office/drawing/2014/chartex" xmlns:mc="http://schemas.openxmlformats.org/markup-compatibility/2006" xmlns:o="urn:schemas-microsoft-com:office:office" xmlns:r="http://schemas.openxmlformats.org/officeDocument/2006/relationships" xmlns:m="http://schemas.openxmlformats.org/officeDocument/2006/math" xmlns:v="urn:schemas-microsoft-com:vml" xmlns:wp14="http://schemas.microsoft.com/office/word/2010/wordprocessingDrawing" xmlns:wp="http://schemas.openxmlformats.org/drawingml/2006/wordprocessingDrawing" xmlns:w10="urn:schemas-microsoft-com:office:word" xmlns:w="http://schemas.openxmlformats.org/wordprocessingml/2006/main" xmlns:w14="http://schemas.microsoft.com/office/word/2010/wordml" xmlns:w15="http://schemas.microsoft.com/office/word/2012/wordml" xmlns:w16se="http://schemas.microsoft.com/office/word/2015/wordml/symex" xmlns:wpg="http://schemas.microsoft.com/office/word/2010/wordprocessingGroup" xmlns:wpi="http://schemas.microsoft.com/office/word/2010/wordprocessingInk" xmlns:wne="http://schemas.microsoft.com/office/word/2006/wordml" xmlns:wps="http://schemas.microsoft.com/office/word/2010/wordprocessingShape" mc:Ignorable="w14 w15 w16se wp14">
   <w:abstractNum w:abstractNumId="0" w15:restartNumberingAfterBreak="0">
     <w:nsid w:val="03F625A4"/>
     <w:multiLevelType w:val="multilevel"/>
@@ -10470,95 +10401,95 @@
       </w:rPr>
     </w:lvl>
   </w:abstractNum>
-  <w:num w:numId="1" w16cid:durableId="1854416910">
+  <w:num w:numId="1">
     <w:abstractNumId w:val="7"/>
   </w:num>
-  <w:num w:numId="2" w16cid:durableId="1508516742">
+  <w:num w:numId="2">
     <w:abstractNumId w:val="11"/>
   </w:num>
-  <w:num w:numId="3" w16cid:durableId="694115557">
+  <w:num w:numId="3">
     <w:abstractNumId w:val="4"/>
   </w:num>
-  <w:num w:numId="4" w16cid:durableId="723060539">
+  <w:num w:numId="4">
     <w:abstractNumId w:val="1"/>
   </w:num>
-  <w:num w:numId="5" w16cid:durableId="888343456">
+  <w:num w:numId="5">
     <w:abstractNumId w:val="0"/>
   </w:num>
-  <w:num w:numId="6" w16cid:durableId="168101639">
+  <w:num w:numId="6">
     <w:abstractNumId w:val="22"/>
   </w:num>
-  <w:num w:numId="7" w16cid:durableId="1134637081">
+  <w:num w:numId="7">
     <w:abstractNumId w:val="16"/>
   </w:num>
-  <w:num w:numId="8" w16cid:durableId="1905599822">
+  <w:num w:numId="8">
     <w:abstractNumId w:val="24"/>
   </w:num>
-  <w:num w:numId="9" w16cid:durableId="604846966">
+  <w:num w:numId="9">
     <w:abstractNumId w:val="18"/>
   </w:num>
-  <w:num w:numId="10" w16cid:durableId="834146510">
+  <w:num w:numId="10">
     <w:abstractNumId w:val="19"/>
   </w:num>
-  <w:num w:numId="11" w16cid:durableId="1637642311">
+  <w:num w:numId="11">
     <w:abstractNumId w:val="17"/>
   </w:num>
-  <w:num w:numId="12" w16cid:durableId="1643457749">
+  <w:num w:numId="12">
     <w:abstractNumId w:val="12"/>
   </w:num>
-  <w:num w:numId="13" w16cid:durableId="1510946453">
+  <w:num w:numId="13">
     <w:abstractNumId w:val="8"/>
   </w:num>
-  <w:num w:numId="14" w16cid:durableId="734663547">
+  <w:num w:numId="14">
     <w:abstractNumId w:val="10"/>
   </w:num>
-  <w:num w:numId="15" w16cid:durableId="529026152">
+  <w:num w:numId="15">
     <w:abstractNumId w:val="2"/>
   </w:num>
-  <w:num w:numId="16" w16cid:durableId="209653041">
+  <w:num w:numId="16">
     <w:abstractNumId w:val="25"/>
   </w:num>
-  <w:num w:numId="17" w16cid:durableId="1575118753">
+  <w:num w:numId="17">
     <w:abstractNumId w:val="14"/>
   </w:num>
-  <w:num w:numId="18" w16cid:durableId="841243255">
+  <w:num w:numId="18">
     <w:abstractNumId w:val="15"/>
   </w:num>
-  <w:num w:numId="19" w16cid:durableId="1549142641">
+  <w:num w:numId="19">
     <w:abstractNumId w:val="23"/>
   </w:num>
-  <w:num w:numId="20" w16cid:durableId="2088765750">
+  <w:num w:numId="20">
     <w:abstractNumId w:val="13"/>
   </w:num>
-  <w:num w:numId="21" w16cid:durableId="953252907">
+  <w:num w:numId="21">
     <w:abstractNumId w:val="3"/>
   </w:num>
-  <w:num w:numId="22" w16cid:durableId="9070147">
+  <w:num w:numId="22">
     <w:abstractNumId w:val="21"/>
   </w:num>
-  <w:num w:numId="23" w16cid:durableId="2122143362">
+  <w:num w:numId="23">
     <w:abstractNumId w:val="26"/>
   </w:num>
-  <w:num w:numId="24" w16cid:durableId="747769498">
+  <w:num w:numId="24">
     <w:abstractNumId w:val="27"/>
   </w:num>
-  <w:num w:numId="25" w16cid:durableId="1549143507">
+  <w:num w:numId="25">
     <w:abstractNumId w:val="20"/>
   </w:num>
-  <w:num w:numId="26" w16cid:durableId="155607667">
+  <w:num w:numId="26">
     <w:abstractNumId w:val="5"/>
   </w:num>
-  <w:num w:numId="27" w16cid:durableId="1104576450">
+  <w:num w:numId="27">
     <w:abstractNumId w:val="9"/>
   </w:num>
-  <w:num w:numId="28" w16cid:durableId="649599312">
+  <w:num w:numId="28">
     <w:abstractNumId w:val="6"/>
   </w:num>
 </w:numbering>
 </file>
 
 <file path=word/styles.xml><?xml version="1.0" encoding="utf-8"?>
-<w:styles xmlns:mc="http://schemas.openxmlformats.org/markup-compatibility/2006" xmlns:r="http://schemas.openxmlformats.org/officeDocument/2006/relationships" xmlns:w="http://schemas.openxmlformats.org/wordprocessingml/2006/main" xmlns:w14="http://schemas.microsoft.com/office/word/2010/wordml" xmlns:w15="http://schemas.microsoft.com/office/word/2012/wordml" xmlns:w16cex="http://schemas.microsoft.com/office/word/2018/wordml/cex" xmlns:w16cid="http://schemas.microsoft.com/office/word/2016/wordml/cid" xmlns:w16="http://schemas.microsoft.com/office/word/2018/wordml" xmlns:w16du="http://schemas.microsoft.com/office/word/2023/wordml/word16du" xmlns:w16sdtdh="http://schemas.microsoft.com/office/word/2020/wordml/sdtdatahash" xmlns:w16sdtfl="http://schemas.microsoft.com/office/word/2024/wordml/sdtformatlock" xmlns:w16se="http://schemas.microsoft.com/office/word/2015/wordml/symex" mc:Ignorable="w14 w15 w16se w16cid w16 w16cex w16sdtdh w16sdtfl w16du">
+<w:styles xmlns:mc="http://schemas.openxmlformats.org/markup-compatibility/2006" xmlns:r="http://schemas.openxmlformats.org/officeDocument/2006/relationships" xmlns:w="http://schemas.openxmlformats.org/wordprocessingml/2006/main" xmlns:w14="http://schemas.microsoft.com/office/word/2010/wordml" xmlns:w15="http://schemas.microsoft.com/office/word/2012/wordml" xmlns:w16se="http://schemas.microsoft.com/office/word/2015/wordml/symex" mc:Ignorable="w14 w15 w16se">
   <w:docDefaults>
     <w:rPrDefault>
       <w:rPr>
@@ -10576,7 +10507,7 @@
       </w:pPr>
     </w:pPrDefault>
   </w:docDefaults>
-  <w:latentStyles w:defLockedState="0" w:defUIPriority="99" w:defSemiHidden="0" w:defUnhideWhenUsed="0" w:defQFormat="0" w:count="376">
+  <w:latentStyles w:defLockedState="0" w:defUIPriority="99" w:defSemiHidden="0" w:defUnhideWhenUsed="0" w:defQFormat="0" w:count="371">
     <w:lsdException w:name="Normal" w:uiPriority="0" w:qFormat="1"/>
     <w:lsdException w:name="heading 1" w:uiPriority="9" w:qFormat="1"/>
     <w:lsdException w:name="heading 2" w:semiHidden="1" w:uiPriority="9" w:unhideWhenUsed="1" w:qFormat="1"/>
@@ -10948,11 +10879,6 @@
     <w:lsdException w:name="List Table 5 Dark Accent 6" w:uiPriority="50"/>
     <w:lsdException w:name="List Table 6 Colorful Accent 6" w:uiPriority="51"/>
     <w:lsdException w:name="List Table 7 Colorful Accent 6" w:uiPriority="52"/>
-    <w:lsdException w:name="Mention" w:semiHidden="1" w:unhideWhenUsed="1"/>
-    <w:lsdException w:name="Smart Hyperlink" w:semiHidden="1" w:unhideWhenUsed="1"/>
-    <w:lsdException w:name="Hashtag" w:semiHidden="1" w:unhideWhenUsed="1"/>
-    <w:lsdException w:name="Unresolved Mention" w:semiHidden="1" w:unhideWhenUsed="1"/>
-    <w:lsdException w:name="Smart Link" w:semiHidden="1" w:unhideWhenUsed="1"/>
   </w:latentStyles>
   <w:style w:type="paragraph" w:default="1" w:styleId="Normal">
     <w:name w:val="Normal"/>

</xml_diff>